<commit_message>
WT: typ kabla = kolumna Producent, srednica = kolumna Srednica (czytane po etykietach, dziala dla obu WT). Opis: podmiana srednicy w tekscie + regeneracja wzoru przywieszki z danymi WT. Zaktualizowany szablon OT 339.docx (bez skanu podpisu)
</commit_message>
<xml_diff>
--- a/OT 339.docx
+++ b/OT 339.docx
@@ -1,6 +1,6 @@
 
 <file path=word/document.xml><?xml version="1.0" encoding="utf-8"?>
-<w:document xmlns:wpc="http://schemas.microsoft.com/office/word/2010/wordprocessingCanvas" xmlns:cx="http://schemas.microsoft.com/office/drawing/2014/chartex" xmlns:cx1="http://schemas.microsoft.com/office/drawing/2015/9/8/chartex" xmlns:cx2="http://schemas.microsoft.com/office/drawing/2015/10/21/chartex" xmlns:cx3="http://schemas.microsoft.com/office/drawing/2016/5/9/chartex" xmlns:cx4="http://schemas.microsoft.com/office/drawing/2016/5/10/chartex" xmlns:cx5="http://schemas.microsoft.com/office/drawing/2016/5/11/chartex" xmlns:cx6="http://schemas.microsoft.com/office/drawing/2016/5/12/chartex" xmlns:cx7="http://schemas.microsoft.com/office/drawing/2016/5/13/chartex" xmlns:cx8="http://schemas.microsoft.com/office/drawing/2016/5/14/chartex" xmlns:mc="http://schemas.openxmlformats.org/markup-compatibility/2006" xmlns:aink="http://schemas.microsoft.com/office/drawing/2016/ink" xmlns:am3d="http://schemas.microsoft.com/office/drawing/2017/model3d" xmlns:o="urn:schemas-microsoft-com:office:office" xmlns:oel="http://schemas.microsoft.com/office/2019/extlst" xmlns:r="http://schemas.openxmlformats.org/officeDocument/2006/relationships" xmlns:m="http://schemas.openxmlformats.org/officeDocument/2006/math" xmlns:v="urn:schemas-microsoft-com:vml" xmlns:wp14="http://schemas.microsoft.com/office/word/2010/wordprocessingDrawing" xmlns:wp="http://schemas.openxmlformats.org/drawingml/2006/wordprocessingDrawing" xmlns:w10="urn:schemas-microsoft-com:office:word" xmlns:w="http://schemas.openxmlformats.org/wordprocessingml/2006/main" xmlns:w14="http://schemas.microsoft.com/office/word/2010/wordml" xmlns:w15="http://schemas.microsoft.com/office/word/2012/wordml" xmlns:w16cex="http://schemas.microsoft.com/office/word/2018/wordml/cex" xmlns:w16cid="http://schemas.microsoft.com/office/word/2016/wordml/cid" xmlns:w16="http://schemas.microsoft.com/office/word/2018/wordml" xmlns:w16sdtdh="http://schemas.microsoft.com/office/word/2020/wordml/sdtdatahash" xmlns:w16se="http://schemas.microsoft.com/office/word/2015/wordml/symex" xmlns:wpg="http://schemas.microsoft.com/office/word/2010/wordprocessingGroup" xmlns:wpi="http://schemas.microsoft.com/office/word/2010/wordprocessingInk" xmlns:wne="http://schemas.microsoft.com/office/word/2006/wordml" xmlns:wps="http://schemas.microsoft.com/office/word/2010/wordprocessingShape" mc:Ignorable="w14 w15 w16se w16cid w16 w16cex w16sdtdh wp14">
+<w:document xmlns:wpc="http://schemas.microsoft.com/office/word/2010/wordprocessingCanvas" xmlns:cx="http://schemas.microsoft.com/office/drawing/2014/chartex" xmlns:cx1="http://schemas.microsoft.com/office/drawing/2015/9/8/chartex" xmlns:cx2="http://schemas.microsoft.com/office/drawing/2015/10/21/chartex" xmlns:cx3="http://schemas.microsoft.com/office/drawing/2016/5/9/chartex" xmlns:cx4="http://schemas.microsoft.com/office/drawing/2016/5/10/chartex" xmlns:cx5="http://schemas.microsoft.com/office/drawing/2016/5/11/chartex" xmlns:cx6="http://schemas.microsoft.com/office/drawing/2016/5/12/chartex" xmlns:cx7="http://schemas.microsoft.com/office/drawing/2016/5/13/chartex" xmlns:cx8="http://schemas.microsoft.com/office/drawing/2016/5/14/chartex" xmlns:mc="http://schemas.openxmlformats.org/markup-compatibility/2006" xmlns:aink="http://schemas.microsoft.com/office/drawing/2016/ink" xmlns:am3d="http://schemas.microsoft.com/office/drawing/2017/model3d" xmlns:o="urn:schemas-microsoft-com:office:office" xmlns:oel="http://schemas.microsoft.com/office/2019/extlst" xmlns:r="http://schemas.openxmlformats.org/officeDocument/2006/relationships" xmlns:m="http://schemas.openxmlformats.org/officeDocument/2006/math" xmlns:v="urn:schemas-microsoft-com:vml" xmlns:wp14="http://schemas.microsoft.com/office/word/2010/wordprocessingDrawing" xmlns:wp="http://schemas.openxmlformats.org/drawingml/2006/wordprocessingDrawing" xmlns:w10="urn:schemas-microsoft-com:office:word" xmlns:w="http://schemas.openxmlformats.org/wordprocessingml/2006/main" xmlns:w14="http://schemas.microsoft.com/office/word/2010/wordml" xmlns:w15="http://schemas.microsoft.com/office/word/2012/wordml" xmlns:w16cex="http://schemas.microsoft.com/office/word/2018/wordml/cex" xmlns:w16cid="http://schemas.microsoft.com/office/word/2016/wordml/cid" xmlns:w16="http://schemas.microsoft.com/office/word/2018/wordml" xmlns:w16du="http://schemas.microsoft.com/office/word/2023/wordml/word16du" xmlns:w16sdtdh="http://schemas.microsoft.com/office/word/2020/wordml/sdtdatahash" xmlns:w16sdtfl="http://schemas.microsoft.com/office/word/2024/wordml/sdtformatlock" xmlns:w16se="http://schemas.microsoft.com/office/word/2015/wordml/symex" xmlns:wpg="http://schemas.microsoft.com/office/word/2010/wordprocessingGroup" xmlns:wpi="http://schemas.microsoft.com/office/word/2010/wordprocessingInk" xmlns:wne="http://schemas.microsoft.com/office/word/2006/wordml" xmlns:wps="http://schemas.microsoft.com/office/word/2010/wordprocessingShape" mc:Ignorable="w14 w15 w16se w16cid w16 w16cex w16sdtdh w16sdtfl w16du wp14">
   <w:body>
     <w:p>
       <w:pPr>
@@ -377,13 +377,23 @@
         </w:rPr>
         <w:tab/>
       </w:r>
+      <w:proofErr w:type="spellStart"/>
       <w:r>
         <w:rPr>
           <w:rFonts w:ascii="Lato" w:hAnsi="Lato"/>
           <w:b/>
           <w:bCs/>
         </w:rPr>
-        <w:t>Wawtel sp. z o. o.</w:t>
+        <w:t>Wawtel</w:t>
+      </w:r>
+      <w:proofErr w:type="spellEnd"/>
+      <w:r>
+        <w:rPr>
+          <w:rFonts w:ascii="Lato" w:hAnsi="Lato"/>
+          <w:b/>
+          <w:bCs/>
+        </w:rPr>
+        <w:t xml:space="preserve"> sp. z o. o.</w:t>
       </w:r>
     </w:p>
     <w:p>
@@ -570,7 +580,6 @@
               <w:left w:val="single" w:sz="1" w:space="0" w:color="000000"/>
               <w:bottom w:val="single" w:sz="1" w:space="0" w:color="000000"/>
             </w:tcBorders>
-            <w:shd w:val="clear" w:color="auto" w:fill="auto"/>
           </w:tcPr>
           <w:p>
             <w:pPr>
@@ -596,7 +605,6 @@
               <w:left w:val="single" w:sz="1" w:space="0" w:color="000000"/>
               <w:bottom w:val="single" w:sz="1" w:space="0" w:color="000000"/>
             </w:tcBorders>
-            <w:shd w:val="clear" w:color="auto" w:fill="auto"/>
           </w:tcPr>
           <w:p>
             <w:pPr>
@@ -622,7 +630,6 @@
               <w:left w:val="single" w:sz="1" w:space="0" w:color="000000"/>
               <w:bottom w:val="single" w:sz="1" w:space="0" w:color="000000"/>
             </w:tcBorders>
-            <w:shd w:val="clear" w:color="auto" w:fill="auto"/>
           </w:tcPr>
           <w:p>
             <w:pPr>
@@ -649,7 +656,6 @@
               <w:bottom w:val="single" w:sz="1" w:space="0" w:color="000000"/>
               <w:right w:val="single" w:sz="1" w:space="0" w:color="000000"/>
             </w:tcBorders>
-            <w:shd w:val="clear" w:color="auto" w:fill="auto"/>
           </w:tcPr>
           <w:p>
             <w:pPr>
@@ -679,7 +685,6 @@
               <w:left w:val="single" w:sz="1" w:space="0" w:color="000000"/>
               <w:bottom w:val="single" w:sz="1" w:space="0" w:color="000000"/>
             </w:tcBorders>
-            <w:shd w:val="clear" w:color="auto" w:fill="auto"/>
             <w:vAlign w:val="center"/>
           </w:tcPr>
           <w:p>
@@ -712,7 +717,6 @@
               <w:left w:val="single" w:sz="1" w:space="0" w:color="000000"/>
               <w:bottom w:val="single" w:sz="1" w:space="0" w:color="000000"/>
             </w:tcBorders>
-            <w:shd w:val="clear" w:color="auto" w:fill="auto"/>
             <w:vAlign w:val="center"/>
           </w:tcPr>
           <w:p>
@@ -727,8 +731,16 @@
               <w:rPr>
                 <w:rFonts w:ascii="Lato" w:hAnsi="Lato" w:cs="Times New Roman"/>
               </w:rPr>
-              <w:t>Wiktor Ostasiewicz</w:t>
-            </w:r>
+              <w:t xml:space="preserve">Wiktor </w:t>
+            </w:r>
+            <w:proofErr w:type="spellStart"/>
+            <w:r>
+              <w:rPr>
+                <w:rFonts w:ascii="Lato" w:hAnsi="Lato" w:cs="Times New Roman"/>
+              </w:rPr>
+              <w:t>Ostasiewicz</w:t>
+            </w:r>
+            <w:proofErr w:type="spellEnd"/>
           </w:p>
         </w:tc>
         <w:tc>
@@ -738,7 +750,6 @@
               <w:left w:val="single" w:sz="1" w:space="0" w:color="000000"/>
               <w:bottom w:val="single" w:sz="1" w:space="0" w:color="000000"/>
             </w:tcBorders>
-            <w:shd w:val="clear" w:color="auto" w:fill="auto"/>
             <w:vAlign w:val="center"/>
           </w:tcPr>
           <w:p>
@@ -766,7 +777,6 @@
               <w:bottom w:val="single" w:sz="1" w:space="0" w:color="000000"/>
               <w:right w:val="single" w:sz="1" w:space="0" w:color="000000"/>
             </w:tcBorders>
-            <w:shd w:val="clear" w:color="auto" w:fill="auto"/>
             <w:vAlign w:val="center"/>
           </w:tcPr>
           <w:p>
@@ -778,76 +788,6 @@
                 <w:rFonts w:ascii="Lato" w:hAnsi="Lato" w:cs="Times New Roman"/>
               </w:rPr>
             </w:pPr>
-            <w:r>
-              <w:rPr>
-                <w:rFonts w:ascii="Lato" w:hAnsi="Lato" w:cs="Arial"/>
-                <w:b/>
-                <w:bCs/>
-                <w:noProof/>
-              </w:rPr>
-              <w:drawing>
-                <wp:anchor distT="0" distB="0" distL="114300" distR="114300" simplePos="0" relativeHeight="251658240" behindDoc="0" locked="0" layoutInCell="1" allowOverlap="1" wp14:anchorId="4B6A6DE5" wp14:editId="4D06B81E">
-                  <wp:simplePos x="0" y="0"/>
-                  <wp:positionH relativeFrom="column">
-                    <wp:posOffset>2540</wp:posOffset>
-                  </wp:positionH>
-                  <wp:positionV relativeFrom="paragraph">
-                    <wp:posOffset>76200</wp:posOffset>
-                  </wp:positionV>
-                  <wp:extent cx="1627200" cy="727200"/>
-                  <wp:effectExtent l="0" t="0" r="0" b="0"/>
-                  <wp:wrapNone/>
-                  <wp:docPr id="3" name="Obraz 3"/>
-                  <wp:cNvGraphicFramePr>
-                    <a:graphicFrameLocks xmlns:a="http://schemas.openxmlformats.org/drawingml/2006/main" noChangeAspect="1"/>
-                  </wp:cNvGraphicFramePr>
-                  <a:graphic xmlns:a="http://schemas.openxmlformats.org/drawingml/2006/main">
-                    <a:graphicData uri="http://schemas.openxmlformats.org/drawingml/2006/picture">
-                      <pic:pic xmlns:pic="http://schemas.openxmlformats.org/drawingml/2006/picture">
-                        <pic:nvPicPr>
-                          <pic:cNvPr id="0" name="Picture 1"/>
-                          <pic:cNvPicPr>
-                            <a:picLocks noChangeAspect="1" noChangeArrowheads="1"/>
-                          </pic:cNvPicPr>
-                        </pic:nvPicPr>
-                        <pic:blipFill>
-                          <a:blip r:embed="rId8" cstate="print">
-                            <a:extLst>
-                              <a:ext uri="{28A0092B-C50C-407E-A947-70E740481C1C}">
-                                <a14:useLocalDpi xmlns:a14="http://schemas.microsoft.com/office/drawing/2010/main" val="0"/>
-                              </a:ext>
-                            </a:extLst>
-                          </a:blip>
-                          <a:srcRect/>
-                          <a:stretch>
-                            <a:fillRect/>
-                          </a:stretch>
-                        </pic:blipFill>
-                        <pic:spPr bwMode="auto">
-                          <a:xfrm>
-                            <a:off x="0" y="0"/>
-                            <a:ext cx="1627200" cy="727200"/>
-                          </a:xfrm>
-                          <a:prstGeom prst="rect">
-                            <a:avLst/>
-                          </a:prstGeom>
-                          <a:noFill/>
-                          <a:ln>
-                            <a:noFill/>
-                          </a:ln>
-                        </pic:spPr>
-                      </pic:pic>
-                    </a:graphicData>
-                  </a:graphic>
-                  <wp14:sizeRelH relativeFrom="page">
-                    <wp14:pctWidth>0</wp14:pctWidth>
-                  </wp14:sizeRelH>
-                  <wp14:sizeRelV relativeFrom="page">
-                    <wp14:pctHeight>0</wp14:pctHeight>
-                  </wp14:sizeRelV>
-                </wp:anchor>
-              </w:drawing>
-            </w:r>
           </w:p>
           <w:p>
             <w:pPr>
@@ -991,7 +931,7 @@
           <w:b/>
         </w:rPr>
         <w:sectPr>
-          <w:headerReference w:type="default" r:id="rId9"/>
+          <w:headerReference w:type="default" r:id="rId8"/>
           <w:pgSz w:w="11906" w:h="16838"/>
           <w:pgMar w:top="1134" w:right="851" w:bottom="1134" w:left="1247" w:header="709" w:footer="709" w:gutter="0"/>
           <w:cols w:space="708"/>
@@ -3880,7 +3820,14 @@
         <w:rPr>
           <w:rFonts w:ascii="Lato" w:hAnsi="Lato"/>
         </w:rPr>
-        <w:t>Z-XOT</w:t>
+        <w:t>Z-</w:t>
+      </w:r>
+      <w:proofErr w:type="spellStart"/>
+      <w:r>
+        <w:rPr>
+          <w:rFonts w:ascii="Lato" w:hAnsi="Lato"/>
+        </w:rPr>
+        <w:t>XOT</w:t>
       </w:r>
       <w:r>
         <w:rPr>
@@ -3888,6 +3835,7 @@
         </w:rPr>
         <w:t>ksd</w:t>
       </w:r>
+      <w:proofErr w:type="spellEnd"/>
     </w:p>
     <w:p>
       <w:pPr>
@@ -4190,15 +4138,24 @@
           <w:rFonts w:ascii="Lato" w:eastAsia="Times New Roman" w:hAnsi="Lato"/>
           <w:color w:val="000000" w:themeColor="text1"/>
         </w:rPr>
-        <w:t>Z-XOT</w:t>
-      </w:r>
+        <w:t>Z-</w:t>
+      </w:r>
+      <w:proofErr w:type="spellStart"/>
       <w:r>
         <w:rPr>
           <w:rFonts w:ascii="Lato" w:eastAsia="Times New Roman" w:hAnsi="Lato"/>
           <w:color w:val="000000" w:themeColor="text1"/>
         </w:rPr>
+        <w:t>XOT</w:t>
+      </w:r>
+      <w:r>
+        <w:rPr>
+          <w:rFonts w:ascii="Lato" w:eastAsia="Times New Roman" w:hAnsi="Lato"/>
+          <w:color w:val="000000" w:themeColor="text1"/>
+        </w:rPr>
         <w:t>ksd</w:t>
       </w:r>
+      <w:proofErr w:type="spellEnd"/>
       <w:r>
         <w:rPr>
           <w:rFonts w:ascii="Lato" w:eastAsia="Times New Roman" w:hAnsi="Lato"/>
@@ -4623,11 +4580,19 @@
         </w:rPr>
         <w:t xml:space="preserve">Inwestorem i zleceniodawcą jest firma </w:t>
       </w:r>
-      <w:r>
-        <w:rPr>
-          <w:rFonts w:ascii="Lato" w:hAnsi="Lato"/>
-        </w:rPr>
-        <w:t>Wawtel sp. z o. o.</w:t>
+      <w:proofErr w:type="spellStart"/>
+      <w:r>
+        <w:rPr>
+          <w:rFonts w:ascii="Lato" w:hAnsi="Lato"/>
+        </w:rPr>
+        <w:t>Wawtel</w:t>
+      </w:r>
+      <w:proofErr w:type="spellEnd"/>
+      <w:r>
+        <w:rPr>
+          <w:rFonts w:ascii="Lato" w:hAnsi="Lato"/>
+        </w:rPr>
+        <w:t xml:space="preserve"> sp. z o. o.</w:t>
       </w:r>
       <w:r>
         <w:rPr>
@@ -5841,17 +5806,32 @@
         </w:rPr>
         <w:t xml:space="preserve"> typu </w:t>
       </w:r>
-      <w:r>
-        <w:rPr>
-          <w:rFonts w:ascii="Lato" w:hAnsi="Lato"/>
-        </w:rPr>
-        <w:t xml:space="preserve">typu </w:t>
-      </w:r>
-      <w:r>
-        <w:rPr>
-          <w:rFonts w:ascii="Lato" w:hAnsi="Lato"/>
-        </w:rPr>
-        <w:t>Z-XOT</w:t>
+      <w:proofErr w:type="spellStart"/>
+      <w:r>
+        <w:rPr>
+          <w:rFonts w:ascii="Lato" w:hAnsi="Lato"/>
+        </w:rPr>
+        <w:t>typu</w:t>
+      </w:r>
+      <w:proofErr w:type="spellEnd"/>
+      <w:r>
+        <w:rPr>
+          <w:rFonts w:ascii="Lato" w:hAnsi="Lato"/>
+        </w:rPr>
+        <w:t xml:space="preserve"> </w:t>
+      </w:r>
+      <w:r>
+        <w:rPr>
+          <w:rFonts w:ascii="Lato" w:hAnsi="Lato"/>
+        </w:rPr>
+        <w:t>Z-</w:t>
+      </w:r>
+      <w:proofErr w:type="spellStart"/>
+      <w:r>
+        <w:rPr>
+          <w:rFonts w:ascii="Lato" w:hAnsi="Lato"/>
+        </w:rPr>
+        <w:t>XOT</w:t>
       </w:r>
       <w:r>
         <w:rPr>
@@ -5859,6 +5839,7 @@
         </w:rPr>
         <w:t>ksd</w:t>
       </w:r>
+      <w:proofErr w:type="spellEnd"/>
       <w:r>
         <w:rPr>
           <w:rFonts w:ascii="Lato" w:hAnsi="Lato"/>
@@ -6225,7 +6206,7 @@
                     <pic:cNvPicPr/>
                   </pic:nvPicPr>
                   <pic:blipFill>
-                    <a:blip r:embed="rId10"/>
+                    <a:blip r:embed="rId9"/>
                     <a:stretch>
                       <a:fillRect/>
                     </a:stretch>
@@ -6389,7 +6370,14 @@
         <w:rPr>
           <w:rFonts w:ascii="Lato" w:hAnsi="Lato"/>
         </w:rPr>
-        <w:t>Z-XOT</w:t>
+        <w:t>Z-</w:t>
+      </w:r>
+      <w:proofErr w:type="spellStart"/>
+      <w:r>
+        <w:rPr>
+          <w:rFonts w:ascii="Lato" w:hAnsi="Lato"/>
+        </w:rPr>
+        <w:t>XOT</w:t>
       </w:r>
       <w:r>
         <w:rPr>
@@ -6403,6 +6391,7 @@
         </w:rPr>
         <w:t>sd</w:t>
       </w:r>
+      <w:proofErr w:type="spellEnd"/>
       <w:r>
         <w:rPr>
           <w:rFonts w:ascii="Lato" w:hAnsi="Lato"/>
@@ -6448,13 +6437,21 @@
           <w:rFonts w:ascii="Lato" w:eastAsia="Times New Roman" w:hAnsi="Lato"/>
           <w:color w:val="000000" w:themeColor="text1"/>
         </w:rPr>
-        <w:t>Z-XOT</w:t>
-      </w:r>
+        <w:t>Z-</w:t>
+      </w:r>
+      <w:proofErr w:type="spellStart"/>
       <w:r>
         <w:rPr>
           <w:rFonts w:ascii="Lato" w:eastAsia="Times New Roman" w:hAnsi="Lato"/>
           <w:color w:val="000000" w:themeColor="text1"/>
         </w:rPr>
+        <w:t>XOT</w:t>
+      </w:r>
+      <w:r>
+        <w:rPr>
+          <w:rFonts w:ascii="Lato" w:eastAsia="Times New Roman" w:hAnsi="Lato"/>
+          <w:color w:val="000000" w:themeColor="text1"/>
+        </w:rPr>
         <w:t>k</w:t>
       </w:r>
       <w:r>
@@ -6464,6 +6461,7 @@
         </w:rPr>
         <w:t>sd</w:t>
       </w:r>
+      <w:proofErr w:type="spellEnd"/>
       <w:r>
         <w:rPr>
           <w:rFonts w:ascii="Lato" w:eastAsia="Times New Roman" w:hAnsi="Lato"/>
@@ -9490,77 +9488,6 @@
           <w:szCs w:val="24"/>
         </w:rPr>
       </w:pPr>
-      <w:r>
-        <w:rPr>
-          <w:rFonts w:ascii="Lato" w:hAnsi="Lato" w:cs="Arial"/>
-          <w:b/>
-          <w:bCs/>
-          <w:noProof/>
-          <w:szCs w:val="24"/>
-        </w:rPr>
-        <w:drawing>
-          <wp:anchor distT="0" distB="0" distL="114300" distR="114300" simplePos="0" relativeHeight="251658752" behindDoc="0" locked="0" layoutInCell="1" allowOverlap="1" wp14:anchorId="3E0DDB74" wp14:editId="413BDDAE">
-            <wp:simplePos x="0" y="0"/>
-            <wp:positionH relativeFrom="column">
-              <wp:posOffset>4550735</wp:posOffset>
-            </wp:positionH>
-            <wp:positionV relativeFrom="paragraph">
-              <wp:posOffset>31263</wp:posOffset>
-            </wp:positionV>
-            <wp:extent cx="1627200" cy="727200"/>
-            <wp:effectExtent l="0" t="0" r="0" b="0"/>
-            <wp:wrapNone/>
-            <wp:docPr id="4" name="Obraz 4"/>
-            <wp:cNvGraphicFramePr>
-              <a:graphicFrameLocks xmlns:a="http://schemas.openxmlformats.org/drawingml/2006/main" noChangeAspect="1"/>
-            </wp:cNvGraphicFramePr>
-            <a:graphic xmlns:a="http://schemas.openxmlformats.org/drawingml/2006/main">
-              <a:graphicData uri="http://schemas.openxmlformats.org/drawingml/2006/picture">
-                <pic:pic xmlns:pic="http://schemas.openxmlformats.org/drawingml/2006/picture">
-                  <pic:nvPicPr>
-                    <pic:cNvPr id="0" name="Picture 1"/>
-                    <pic:cNvPicPr>
-                      <a:picLocks noChangeAspect="1" noChangeArrowheads="1"/>
-                    </pic:cNvPicPr>
-                  </pic:nvPicPr>
-                  <pic:blipFill>
-                    <a:blip r:embed="rId8" cstate="print">
-                      <a:extLst>
-                        <a:ext uri="{28A0092B-C50C-407E-A947-70E740481C1C}">
-                          <a14:useLocalDpi xmlns:a14="http://schemas.microsoft.com/office/drawing/2010/main" val="0"/>
-                        </a:ext>
-                      </a:extLst>
-                    </a:blip>
-                    <a:srcRect/>
-                    <a:stretch>
-                      <a:fillRect/>
-                    </a:stretch>
-                  </pic:blipFill>
-                  <pic:spPr bwMode="auto">
-                    <a:xfrm>
-                      <a:off x="0" y="0"/>
-                      <a:ext cx="1627200" cy="727200"/>
-                    </a:xfrm>
-                    <a:prstGeom prst="rect">
-                      <a:avLst/>
-                    </a:prstGeom>
-                    <a:noFill/>
-                    <a:ln>
-                      <a:noFill/>
-                    </a:ln>
-                  </pic:spPr>
-                </pic:pic>
-              </a:graphicData>
-            </a:graphic>
-            <wp14:sizeRelH relativeFrom="page">
-              <wp14:pctWidth>0</wp14:pctWidth>
-            </wp14:sizeRelH>
-            <wp14:sizeRelV relativeFrom="page">
-              <wp14:pctHeight>0</wp14:pctHeight>
-            </wp14:sizeRelV>
-          </wp:anchor>
-        </w:drawing>
-      </w:r>
     </w:p>
     <w:p>
       <w:pPr>
@@ -9721,7 +9648,14 @@
         <w:rPr>
           <w:rFonts w:ascii="Lato" w:hAnsi="Lato"/>
         </w:rPr>
-        <w:t>Z-XO</w:t>
+        <w:t>Z-</w:t>
+      </w:r>
+      <w:proofErr w:type="spellStart"/>
+      <w:r>
+        <w:rPr>
+          <w:rFonts w:ascii="Lato" w:hAnsi="Lato"/>
+        </w:rPr>
+        <w:t>XO</w:t>
       </w:r>
       <w:r>
         <w:rPr>
@@ -9729,6 +9663,7 @@
         </w:rPr>
         <w:t>Tksd</w:t>
       </w:r>
+      <w:proofErr w:type="spellEnd"/>
       <w:r>
         <w:rPr>
           <w:rFonts w:ascii="Lato" w:eastAsia="Times New Roman" w:hAnsi="Lato"/>
@@ -10132,7 +10067,7 @@
 </file>
 
 <file path=word/endnotes.xml><?xml version="1.0" encoding="utf-8"?>
-<w:endnotes xmlns:wpc="http://schemas.microsoft.com/office/word/2010/wordprocessingCanvas" xmlns:cx="http://schemas.microsoft.com/office/drawing/2014/chartex" xmlns:cx1="http://schemas.microsoft.com/office/drawing/2015/9/8/chartex" xmlns:cx2="http://schemas.microsoft.com/office/drawing/2015/10/21/chartex" xmlns:cx3="http://schemas.microsoft.com/office/drawing/2016/5/9/chartex" xmlns:cx4="http://schemas.microsoft.com/office/drawing/2016/5/10/chartex" xmlns:cx5="http://schemas.microsoft.com/office/drawing/2016/5/11/chartex" xmlns:cx6="http://schemas.microsoft.com/office/drawing/2016/5/12/chartex" xmlns:cx7="http://schemas.microsoft.com/office/drawing/2016/5/13/chartex" xmlns:cx8="http://schemas.microsoft.com/office/drawing/2016/5/14/chartex" xmlns:mc="http://schemas.openxmlformats.org/markup-compatibility/2006" xmlns:aink="http://schemas.microsoft.com/office/drawing/2016/ink" xmlns:am3d="http://schemas.microsoft.com/office/drawing/2017/model3d" xmlns:o="urn:schemas-microsoft-com:office:office" xmlns:oel="http://schemas.microsoft.com/office/2019/extlst" xmlns:r="http://schemas.openxmlformats.org/officeDocument/2006/relationships" xmlns:m="http://schemas.openxmlformats.org/officeDocument/2006/math" xmlns:v="urn:schemas-microsoft-com:vml" xmlns:wp14="http://schemas.microsoft.com/office/word/2010/wordprocessingDrawing" xmlns:wp="http://schemas.openxmlformats.org/drawingml/2006/wordprocessingDrawing" xmlns:w10="urn:schemas-microsoft-com:office:word" xmlns:w="http://schemas.openxmlformats.org/wordprocessingml/2006/main" xmlns:w14="http://schemas.microsoft.com/office/word/2010/wordml" xmlns:w15="http://schemas.microsoft.com/office/word/2012/wordml" xmlns:w16cex="http://schemas.microsoft.com/office/word/2018/wordml/cex" xmlns:w16cid="http://schemas.microsoft.com/office/word/2016/wordml/cid" xmlns:w16="http://schemas.microsoft.com/office/word/2018/wordml" xmlns:w16sdtdh="http://schemas.microsoft.com/office/word/2020/wordml/sdtdatahash" xmlns:w16se="http://schemas.microsoft.com/office/word/2015/wordml/symex" xmlns:wpg="http://schemas.microsoft.com/office/word/2010/wordprocessingGroup" xmlns:wpi="http://schemas.microsoft.com/office/word/2010/wordprocessingInk" xmlns:wne="http://schemas.microsoft.com/office/word/2006/wordml" xmlns:wps="http://schemas.microsoft.com/office/word/2010/wordprocessingShape" mc:Ignorable="w14 w15 w16se w16cid w16 w16cex w16sdtdh wp14">
+<w:endnotes xmlns:wpc="http://schemas.microsoft.com/office/word/2010/wordprocessingCanvas" xmlns:cx="http://schemas.microsoft.com/office/drawing/2014/chartex" xmlns:cx1="http://schemas.microsoft.com/office/drawing/2015/9/8/chartex" xmlns:cx2="http://schemas.microsoft.com/office/drawing/2015/10/21/chartex" xmlns:cx3="http://schemas.microsoft.com/office/drawing/2016/5/9/chartex" xmlns:cx4="http://schemas.microsoft.com/office/drawing/2016/5/10/chartex" xmlns:cx5="http://schemas.microsoft.com/office/drawing/2016/5/11/chartex" xmlns:cx6="http://schemas.microsoft.com/office/drawing/2016/5/12/chartex" xmlns:cx7="http://schemas.microsoft.com/office/drawing/2016/5/13/chartex" xmlns:cx8="http://schemas.microsoft.com/office/drawing/2016/5/14/chartex" xmlns:mc="http://schemas.openxmlformats.org/markup-compatibility/2006" xmlns:aink="http://schemas.microsoft.com/office/drawing/2016/ink" xmlns:am3d="http://schemas.microsoft.com/office/drawing/2017/model3d" xmlns:o="urn:schemas-microsoft-com:office:office" xmlns:oel="http://schemas.microsoft.com/office/2019/extlst" xmlns:r="http://schemas.openxmlformats.org/officeDocument/2006/relationships" xmlns:m="http://schemas.openxmlformats.org/officeDocument/2006/math" xmlns:v="urn:schemas-microsoft-com:vml" xmlns:wp14="http://schemas.microsoft.com/office/word/2010/wordprocessingDrawing" xmlns:wp="http://schemas.openxmlformats.org/drawingml/2006/wordprocessingDrawing" xmlns:w10="urn:schemas-microsoft-com:office:word" xmlns:w="http://schemas.openxmlformats.org/wordprocessingml/2006/main" xmlns:w14="http://schemas.microsoft.com/office/word/2010/wordml" xmlns:w15="http://schemas.microsoft.com/office/word/2012/wordml" xmlns:w16cex="http://schemas.microsoft.com/office/word/2018/wordml/cex" xmlns:w16cid="http://schemas.microsoft.com/office/word/2016/wordml/cid" xmlns:w16="http://schemas.microsoft.com/office/word/2018/wordml" xmlns:w16du="http://schemas.microsoft.com/office/word/2023/wordml/word16du" xmlns:w16sdtdh="http://schemas.microsoft.com/office/word/2020/wordml/sdtdatahash" xmlns:w16sdtfl="http://schemas.microsoft.com/office/word/2024/wordml/sdtformatlock" xmlns:w16se="http://schemas.microsoft.com/office/word/2015/wordml/symex" xmlns:wpg="http://schemas.microsoft.com/office/word/2010/wordprocessingGroup" xmlns:wpi="http://schemas.microsoft.com/office/word/2010/wordprocessingInk" xmlns:wne="http://schemas.microsoft.com/office/word/2006/wordml" xmlns:wps="http://schemas.microsoft.com/office/word/2010/wordprocessingShape" mc:Ignorable="w14 w15 w16se w16cid w16 w16cex w16sdtdh w16sdtfl w16du wp14">
   <w:endnote w:type="separator" w:id="-1">
     <w:p>
       <w:pPr>
@@ -10157,7 +10092,7 @@
 </file>
 
 <file path=word/footnotes.xml><?xml version="1.0" encoding="utf-8"?>
-<w:footnotes xmlns:wpc="http://schemas.microsoft.com/office/word/2010/wordprocessingCanvas" xmlns:cx="http://schemas.microsoft.com/office/drawing/2014/chartex" xmlns:cx1="http://schemas.microsoft.com/office/drawing/2015/9/8/chartex" xmlns:cx2="http://schemas.microsoft.com/office/drawing/2015/10/21/chartex" xmlns:cx3="http://schemas.microsoft.com/office/drawing/2016/5/9/chartex" xmlns:cx4="http://schemas.microsoft.com/office/drawing/2016/5/10/chartex" xmlns:cx5="http://schemas.microsoft.com/office/drawing/2016/5/11/chartex" xmlns:cx6="http://schemas.microsoft.com/office/drawing/2016/5/12/chartex" xmlns:cx7="http://schemas.microsoft.com/office/drawing/2016/5/13/chartex" xmlns:cx8="http://schemas.microsoft.com/office/drawing/2016/5/14/chartex" xmlns:mc="http://schemas.openxmlformats.org/markup-compatibility/2006" xmlns:aink="http://schemas.microsoft.com/office/drawing/2016/ink" xmlns:am3d="http://schemas.microsoft.com/office/drawing/2017/model3d" xmlns:o="urn:schemas-microsoft-com:office:office" xmlns:oel="http://schemas.microsoft.com/office/2019/extlst" xmlns:r="http://schemas.openxmlformats.org/officeDocument/2006/relationships" xmlns:m="http://schemas.openxmlformats.org/officeDocument/2006/math" xmlns:v="urn:schemas-microsoft-com:vml" xmlns:wp14="http://schemas.microsoft.com/office/word/2010/wordprocessingDrawing" xmlns:wp="http://schemas.openxmlformats.org/drawingml/2006/wordprocessingDrawing" xmlns:w10="urn:schemas-microsoft-com:office:word" xmlns:w="http://schemas.openxmlformats.org/wordprocessingml/2006/main" xmlns:w14="http://schemas.microsoft.com/office/word/2010/wordml" xmlns:w15="http://schemas.microsoft.com/office/word/2012/wordml" xmlns:w16cex="http://schemas.microsoft.com/office/word/2018/wordml/cex" xmlns:w16cid="http://schemas.microsoft.com/office/word/2016/wordml/cid" xmlns:w16="http://schemas.microsoft.com/office/word/2018/wordml" xmlns:w16sdtdh="http://schemas.microsoft.com/office/word/2020/wordml/sdtdatahash" xmlns:w16se="http://schemas.microsoft.com/office/word/2015/wordml/symex" xmlns:wpg="http://schemas.microsoft.com/office/word/2010/wordprocessingGroup" xmlns:wpi="http://schemas.microsoft.com/office/word/2010/wordprocessingInk" xmlns:wne="http://schemas.microsoft.com/office/word/2006/wordml" xmlns:wps="http://schemas.microsoft.com/office/word/2010/wordprocessingShape" mc:Ignorable="w14 w15 w16se w16cid w16 w16cex w16sdtdh wp14">
+<w:footnotes xmlns:wpc="http://schemas.microsoft.com/office/word/2010/wordprocessingCanvas" xmlns:cx="http://schemas.microsoft.com/office/drawing/2014/chartex" xmlns:cx1="http://schemas.microsoft.com/office/drawing/2015/9/8/chartex" xmlns:cx2="http://schemas.microsoft.com/office/drawing/2015/10/21/chartex" xmlns:cx3="http://schemas.microsoft.com/office/drawing/2016/5/9/chartex" xmlns:cx4="http://schemas.microsoft.com/office/drawing/2016/5/10/chartex" xmlns:cx5="http://schemas.microsoft.com/office/drawing/2016/5/11/chartex" xmlns:cx6="http://schemas.microsoft.com/office/drawing/2016/5/12/chartex" xmlns:cx7="http://schemas.microsoft.com/office/drawing/2016/5/13/chartex" xmlns:cx8="http://schemas.microsoft.com/office/drawing/2016/5/14/chartex" xmlns:mc="http://schemas.openxmlformats.org/markup-compatibility/2006" xmlns:aink="http://schemas.microsoft.com/office/drawing/2016/ink" xmlns:am3d="http://schemas.microsoft.com/office/drawing/2017/model3d" xmlns:o="urn:schemas-microsoft-com:office:office" xmlns:oel="http://schemas.microsoft.com/office/2019/extlst" xmlns:r="http://schemas.openxmlformats.org/officeDocument/2006/relationships" xmlns:m="http://schemas.openxmlformats.org/officeDocument/2006/math" xmlns:v="urn:schemas-microsoft-com:vml" xmlns:wp14="http://schemas.microsoft.com/office/word/2010/wordprocessingDrawing" xmlns:wp="http://schemas.openxmlformats.org/drawingml/2006/wordprocessingDrawing" xmlns:w10="urn:schemas-microsoft-com:office:word" xmlns:w="http://schemas.openxmlformats.org/wordprocessingml/2006/main" xmlns:w14="http://schemas.microsoft.com/office/word/2010/wordml" xmlns:w15="http://schemas.microsoft.com/office/word/2012/wordml" xmlns:w16cex="http://schemas.microsoft.com/office/word/2018/wordml/cex" xmlns:w16cid="http://schemas.microsoft.com/office/word/2016/wordml/cid" xmlns:w16="http://schemas.microsoft.com/office/word/2018/wordml" xmlns:w16du="http://schemas.microsoft.com/office/word/2023/wordml/word16du" xmlns:w16sdtdh="http://schemas.microsoft.com/office/word/2020/wordml/sdtdatahash" xmlns:w16sdtfl="http://schemas.microsoft.com/office/word/2024/wordml/sdtformatlock" xmlns:w16se="http://schemas.microsoft.com/office/word/2015/wordml/symex" xmlns:wpg="http://schemas.microsoft.com/office/word/2010/wordprocessingGroup" xmlns:wpi="http://schemas.microsoft.com/office/word/2010/wordprocessingInk" xmlns:wne="http://schemas.microsoft.com/office/word/2006/wordml" xmlns:wps="http://schemas.microsoft.com/office/word/2010/wordprocessingShape" mc:Ignorable="w14 w15 w16se w16cid w16 w16cex w16sdtdh w16sdtfl w16du wp14">
   <w:footnote w:type="separator" w:id="-1">
     <w:p>
       <w:pPr>
@@ -10182,7 +10117,7 @@
 </file>
 
 <file path=word/header1.xml><?xml version="1.0" encoding="utf-8"?>
-<w:hdr xmlns:wpc="http://schemas.microsoft.com/office/word/2010/wordprocessingCanvas" xmlns:cx="http://schemas.microsoft.com/office/drawing/2014/chartex" xmlns:cx1="http://schemas.microsoft.com/office/drawing/2015/9/8/chartex" xmlns:cx2="http://schemas.microsoft.com/office/drawing/2015/10/21/chartex" xmlns:cx3="http://schemas.microsoft.com/office/drawing/2016/5/9/chartex" xmlns:cx4="http://schemas.microsoft.com/office/drawing/2016/5/10/chartex" xmlns:cx5="http://schemas.microsoft.com/office/drawing/2016/5/11/chartex" xmlns:cx6="http://schemas.microsoft.com/office/drawing/2016/5/12/chartex" xmlns:cx7="http://schemas.microsoft.com/office/drawing/2016/5/13/chartex" xmlns:cx8="http://schemas.microsoft.com/office/drawing/2016/5/14/chartex" xmlns:mc="http://schemas.openxmlformats.org/markup-compatibility/2006" xmlns:aink="http://schemas.microsoft.com/office/drawing/2016/ink" xmlns:am3d="http://schemas.microsoft.com/office/drawing/2017/model3d" xmlns:o="urn:schemas-microsoft-com:office:office" xmlns:oel="http://schemas.microsoft.com/office/2019/extlst" xmlns:r="http://schemas.openxmlformats.org/officeDocument/2006/relationships" xmlns:m="http://schemas.openxmlformats.org/officeDocument/2006/math" xmlns:v="urn:schemas-microsoft-com:vml" xmlns:wp14="http://schemas.microsoft.com/office/word/2010/wordprocessingDrawing" xmlns:wp="http://schemas.openxmlformats.org/drawingml/2006/wordprocessingDrawing" xmlns:w10="urn:schemas-microsoft-com:office:word" xmlns:w="http://schemas.openxmlformats.org/wordprocessingml/2006/main" xmlns:w14="http://schemas.microsoft.com/office/word/2010/wordml" xmlns:w15="http://schemas.microsoft.com/office/word/2012/wordml" xmlns:w16cex="http://schemas.microsoft.com/office/word/2018/wordml/cex" xmlns:w16cid="http://schemas.microsoft.com/office/word/2016/wordml/cid" xmlns:w16="http://schemas.microsoft.com/office/word/2018/wordml" xmlns:w16sdtdh="http://schemas.microsoft.com/office/word/2020/wordml/sdtdatahash" xmlns:w16se="http://schemas.microsoft.com/office/word/2015/wordml/symex" xmlns:wpg="http://schemas.microsoft.com/office/word/2010/wordprocessingGroup" xmlns:wpi="http://schemas.microsoft.com/office/word/2010/wordprocessingInk" xmlns:wne="http://schemas.microsoft.com/office/word/2006/wordml" xmlns:wps="http://schemas.microsoft.com/office/word/2010/wordprocessingShape" mc:Ignorable="w14 w15 w16se w16cid w16 w16cex w16sdtdh wp14">
+<w:hdr xmlns:wpc="http://schemas.microsoft.com/office/word/2010/wordprocessingCanvas" xmlns:cx="http://schemas.microsoft.com/office/drawing/2014/chartex" xmlns:cx1="http://schemas.microsoft.com/office/drawing/2015/9/8/chartex" xmlns:cx2="http://schemas.microsoft.com/office/drawing/2015/10/21/chartex" xmlns:cx3="http://schemas.microsoft.com/office/drawing/2016/5/9/chartex" xmlns:cx4="http://schemas.microsoft.com/office/drawing/2016/5/10/chartex" xmlns:cx5="http://schemas.microsoft.com/office/drawing/2016/5/11/chartex" xmlns:cx6="http://schemas.microsoft.com/office/drawing/2016/5/12/chartex" xmlns:cx7="http://schemas.microsoft.com/office/drawing/2016/5/13/chartex" xmlns:cx8="http://schemas.microsoft.com/office/drawing/2016/5/14/chartex" xmlns:mc="http://schemas.openxmlformats.org/markup-compatibility/2006" xmlns:aink="http://schemas.microsoft.com/office/drawing/2016/ink" xmlns:am3d="http://schemas.microsoft.com/office/drawing/2017/model3d" xmlns:o="urn:schemas-microsoft-com:office:office" xmlns:oel="http://schemas.microsoft.com/office/2019/extlst" xmlns:r="http://schemas.openxmlformats.org/officeDocument/2006/relationships" xmlns:m="http://schemas.openxmlformats.org/officeDocument/2006/math" xmlns:v="urn:schemas-microsoft-com:vml" xmlns:wp14="http://schemas.microsoft.com/office/word/2010/wordprocessingDrawing" xmlns:wp="http://schemas.openxmlformats.org/drawingml/2006/wordprocessingDrawing" xmlns:w10="urn:schemas-microsoft-com:office:word" xmlns:w="http://schemas.openxmlformats.org/wordprocessingml/2006/main" xmlns:w14="http://schemas.microsoft.com/office/word/2010/wordml" xmlns:w15="http://schemas.microsoft.com/office/word/2012/wordml" xmlns:w16cex="http://schemas.microsoft.com/office/word/2018/wordml/cex" xmlns:w16cid="http://schemas.microsoft.com/office/word/2016/wordml/cid" xmlns:w16="http://schemas.microsoft.com/office/word/2018/wordml" xmlns:w16du="http://schemas.microsoft.com/office/word/2023/wordml/word16du" xmlns:w16sdtdh="http://schemas.microsoft.com/office/word/2020/wordml/sdtdatahash" xmlns:w16sdtfl="http://schemas.microsoft.com/office/word/2024/wordml/sdtformatlock" xmlns:w16se="http://schemas.microsoft.com/office/word/2015/wordml/symex" xmlns:wpg="http://schemas.microsoft.com/office/word/2010/wordprocessingGroup" xmlns:wpi="http://schemas.microsoft.com/office/word/2010/wordprocessingInk" xmlns:wne="http://schemas.microsoft.com/office/word/2006/wordml" xmlns:wps="http://schemas.microsoft.com/office/word/2010/wordprocessingShape" mc:Ignorable="w14 w15 w16se w16cid w16 w16cex w16sdtdh w16sdtfl w16du wp14">
   <w:tbl>
     <w:tblPr>
       <w:tblStyle w:val="Tabela-Siatka"/>
@@ -10197,8 +10132,8 @@
     </w:tblPr>
     <w:tblGrid>
       <w:gridCol w:w="2977"/>
-      <w:gridCol w:w="4476"/>
-      <w:gridCol w:w="2373"/>
+      <w:gridCol w:w="4475"/>
+      <w:gridCol w:w="2374"/>
     </w:tblGrid>
     <w:tr>
       <w:trPr>
@@ -10386,7 +10321,7 @@
 </file>
 
 <file path=word/numbering.xml><?xml version="1.0" encoding="utf-8"?>
-<w:numbering xmlns:wpc="http://schemas.microsoft.com/office/word/2010/wordprocessingCanvas" xmlns:cx="http://schemas.microsoft.com/office/drawing/2014/chartex" xmlns:cx1="http://schemas.microsoft.com/office/drawing/2015/9/8/chartex" xmlns:cx2="http://schemas.microsoft.com/office/drawing/2015/10/21/chartex" xmlns:cx3="http://schemas.microsoft.com/office/drawing/2016/5/9/chartex" xmlns:cx4="http://schemas.microsoft.com/office/drawing/2016/5/10/chartex" xmlns:cx5="http://schemas.microsoft.com/office/drawing/2016/5/11/chartex" xmlns:cx6="http://schemas.microsoft.com/office/drawing/2016/5/12/chartex" xmlns:cx7="http://schemas.microsoft.com/office/drawing/2016/5/13/chartex" xmlns:cx8="http://schemas.microsoft.com/office/drawing/2016/5/14/chartex" xmlns:mc="http://schemas.openxmlformats.org/markup-compatibility/2006" xmlns:aink="http://schemas.microsoft.com/office/drawing/2016/ink" xmlns:am3d="http://schemas.microsoft.com/office/drawing/2017/model3d" xmlns:o="urn:schemas-microsoft-com:office:office" xmlns:oel="http://schemas.microsoft.com/office/2019/extlst" xmlns:r="http://schemas.openxmlformats.org/officeDocument/2006/relationships" xmlns:m="http://schemas.openxmlformats.org/officeDocument/2006/math" xmlns:v="urn:schemas-microsoft-com:vml" xmlns:wp14="http://schemas.microsoft.com/office/word/2010/wordprocessingDrawing" xmlns:wp="http://schemas.openxmlformats.org/drawingml/2006/wordprocessingDrawing" xmlns:w10="urn:schemas-microsoft-com:office:word" xmlns:w="http://schemas.openxmlformats.org/wordprocessingml/2006/main" xmlns:w14="http://schemas.microsoft.com/office/word/2010/wordml" xmlns:w15="http://schemas.microsoft.com/office/word/2012/wordml" xmlns:w16cex="http://schemas.microsoft.com/office/word/2018/wordml/cex" xmlns:w16cid="http://schemas.microsoft.com/office/word/2016/wordml/cid" xmlns:w16="http://schemas.microsoft.com/office/word/2018/wordml" xmlns:w16sdtdh="http://schemas.microsoft.com/office/word/2020/wordml/sdtdatahash" xmlns:w16se="http://schemas.microsoft.com/office/word/2015/wordml/symex" xmlns:wpg="http://schemas.microsoft.com/office/word/2010/wordprocessingGroup" xmlns:wpi="http://schemas.microsoft.com/office/word/2010/wordprocessingInk" xmlns:wne="http://schemas.microsoft.com/office/word/2006/wordml" xmlns:wps="http://schemas.microsoft.com/office/word/2010/wordprocessingShape" mc:Ignorable="w14 w15 w16se w16cid w16 w16cex w16sdtdh wp14">
+<w:numbering xmlns:wpc="http://schemas.microsoft.com/office/word/2010/wordprocessingCanvas" xmlns:cx="http://schemas.microsoft.com/office/drawing/2014/chartex" xmlns:cx1="http://schemas.microsoft.com/office/drawing/2015/9/8/chartex" xmlns:cx2="http://schemas.microsoft.com/office/drawing/2015/10/21/chartex" xmlns:cx3="http://schemas.microsoft.com/office/drawing/2016/5/9/chartex" xmlns:cx4="http://schemas.microsoft.com/office/drawing/2016/5/10/chartex" xmlns:cx5="http://schemas.microsoft.com/office/drawing/2016/5/11/chartex" xmlns:cx6="http://schemas.microsoft.com/office/drawing/2016/5/12/chartex" xmlns:cx7="http://schemas.microsoft.com/office/drawing/2016/5/13/chartex" xmlns:cx8="http://schemas.microsoft.com/office/drawing/2016/5/14/chartex" xmlns:mc="http://schemas.openxmlformats.org/markup-compatibility/2006" xmlns:aink="http://schemas.microsoft.com/office/drawing/2016/ink" xmlns:am3d="http://schemas.microsoft.com/office/drawing/2017/model3d" xmlns:o="urn:schemas-microsoft-com:office:office" xmlns:oel="http://schemas.microsoft.com/office/2019/extlst" xmlns:r="http://schemas.openxmlformats.org/officeDocument/2006/relationships" xmlns:m="http://schemas.openxmlformats.org/officeDocument/2006/math" xmlns:v="urn:schemas-microsoft-com:vml" xmlns:wp14="http://schemas.microsoft.com/office/word/2010/wordprocessingDrawing" xmlns:wp="http://schemas.openxmlformats.org/drawingml/2006/wordprocessingDrawing" xmlns:w10="urn:schemas-microsoft-com:office:word" xmlns:w="http://schemas.openxmlformats.org/wordprocessingml/2006/main" xmlns:w14="http://schemas.microsoft.com/office/word/2010/wordml" xmlns:w15="http://schemas.microsoft.com/office/word/2012/wordml" xmlns:w16cex="http://schemas.microsoft.com/office/word/2018/wordml/cex" xmlns:w16cid="http://schemas.microsoft.com/office/word/2016/wordml/cid" xmlns:w16="http://schemas.microsoft.com/office/word/2018/wordml" xmlns:w16du="http://schemas.microsoft.com/office/word/2023/wordml/word16du" xmlns:w16sdtdh="http://schemas.microsoft.com/office/word/2020/wordml/sdtdatahash" xmlns:w16sdtfl="http://schemas.microsoft.com/office/word/2024/wordml/sdtformatlock" xmlns:w16se="http://schemas.microsoft.com/office/word/2015/wordml/symex" xmlns:wpg="http://schemas.microsoft.com/office/word/2010/wordprocessingGroup" xmlns:wpi="http://schemas.microsoft.com/office/word/2010/wordprocessingInk" xmlns:wne="http://schemas.microsoft.com/office/word/2006/wordml" xmlns:wps="http://schemas.microsoft.com/office/word/2010/wordprocessingShape" mc:Ignorable="w14 w15 w16se w16cid w16 w16cex w16sdtdh w16sdtfl w16du wp14">
   <w:abstractNum w:abstractNumId="0" w15:restartNumberingAfterBreak="0">
     <w:nsid w:val="FFFFFF83"/>
     <w:multiLevelType w:val="singleLevel"/>
@@ -15902,7 +15837,7 @@
 </file>
 
 <file path=word/styles.xml><?xml version="1.0" encoding="utf-8"?>
-<w:styles xmlns:mc="http://schemas.openxmlformats.org/markup-compatibility/2006" xmlns:r="http://schemas.openxmlformats.org/officeDocument/2006/relationships" xmlns:w="http://schemas.openxmlformats.org/wordprocessingml/2006/main" xmlns:w14="http://schemas.microsoft.com/office/word/2010/wordml" xmlns:w15="http://schemas.microsoft.com/office/word/2012/wordml" xmlns:w16cex="http://schemas.microsoft.com/office/word/2018/wordml/cex" xmlns:w16cid="http://schemas.microsoft.com/office/word/2016/wordml/cid" xmlns:w16="http://schemas.microsoft.com/office/word/2018/wordml" xmlns:w16sdtdh="http://schemas.microsoft.com/office/word/2020/wordml/sdtdatahash" xmlns:w16se="http://schemas.microsoft.com/office/word/2015/wordml/symex" mc:Ignorable="w14 w15 w16se w16cid w16 w16cex w16sdtdh">
+<w:styles xmlns:mc="http://schemas.openxmlformats.org/markup-compatibility/2006" xmlns:r="http://schemas.openxmlformats.org/officeDocument/2006/relationships" xmlns:w="http://schemas.openxmlformats.org/wordprocessingml/2006/main" xmlns:w14="http://schemas.microsoft.com/office/word/2010/wordml" xmlns:w15="http://schemas.microsoft.com/office/word/2012/wordml" xmlns:w16cex="http://schemas.microsoft.com/office/word/2018/wordml/cex" xmlns:w16cid="http://schemas.microsoft.com/office/word/2016/wordml/cid" xmlns:w16="http://schemas.microsoft.com/office/word/2018/wordml" xmlns:w16du="http://schemas.microsoft.com/office/word/2023/wordml/word16du" xmlns:w16sdtdh="http://schemas.microsoft.com/office/word/2020/wordml/sdtdatahash" xmlns:w16sdtfl="http://schemas.microsoft.com/office/word/2024/wordml/sdtformatlock" xmlns:w16se="http://schemas.microsoft.com/office/word/2015/wordml/symex" mc:Ignorable="w14 w15 w16se w16cid w16 w16cex w16sdtdh w16sdtfl w16du">
   <w:docDefaults>
     <w:rPrDefault>
       <w:rPr>

</xml_diff>